<commit_message>
Digital Minds submission completed and final repository update
</commit_message>
<xml_diff>
--- a/Submission_Report.docx
+++ b/Submission_Report.docx
@@ -89,30 +89,6 @@
     </w:p>
     <w:p>
       <w:pPr>
-        <w:pStyle w:val="BlockText"/>
-      </w:pPr>
-      <w:r>
-        <w:rPr>
-          <w:b/>
-          <w:bCs/>
-        </w:rPr>
-        <w:t>This is the judge-facing submission report.</w:t>
-      </w:r>
-      <w:r>
-        <w:t xml:space="preserve"> The full technical record — all methods, tables, verification, provenance, cost and appendices A–K — is </w:t>
-      </w:r>
-      <w:r>
-        <w:rPr>
-          <w:rStyle w:val="VerbatimChar"/>
-        </w:rPr>
-        <w:t>10_report.md</w:t>
-      </w:r>
-      <w:r>
-        <w:t>. Every number here is in it.</w:t>
-      </w:r>
-    </w:p>
-    <w:p>
-      <w:pPr>
         <w:pStyle w:val="Heading2"/>
       </w:pPr>
       <w:bookmarkStart w:id="1" w:name="abstract"/>
@@ -143,18 +119,15 @@
         <w:pStyle w:val="FirstParagraph"/>
       </w:pPr>
       <w:r>
-        <w:t xml:space="preserve">People — including researchers — treat an AI's self-report as if it knows something special about itself. Preference elicitation, distress signals and most practical model-welfare </w:t>
-      </w:r>
+        <w:t>People — including researchers — treat an AI's self-report as if it knows something special about itself. Preference elicitation, distress signals and most practical model-welfare methodology run through self-report. If a model's report about itself carries no epistemic advantage over what a comparably capable outsider could infer from the same text, those methods are measuring something other than what they claim, and both over- and under-attribution of moral significance get likelier.</w:t>
+      </w:r>
+    </w:p>
+    <w:p>
+      <w:pPr>
+        <w:pStyle w:val="BodyText"/>
+      </w:pPr>
       <w:r>
         <w:lastRenderedPageBreak/>
-        <w:t>methodology run through self-report. If a model's report about itself carries no epistemic advantage over what a comparably capable outsider could infer from the same text, those methods are measuring something other than what they claim, and both over- and under-attribution of moral significance get likelier.</w:t>
-      </w:r>
-    </w:p>
-    <w:p>
-      <w:pPr>
-        <w:pStyle w:val="BodyText"/>
-      </w:pPr>
-      <w:r>
         <w:t xml:space="preserve">So the question is not </w:t>
       </w:r>
       <w:r>
@@ -398,32 +371,29 @@
         <w:t>21 textual features</w:t>
       </w:r>
       <w:r>
-        <w:t xml:space="preserve"> — 18 structural/style statistics (length, sentence count, type-token ratio, hedge rate, modal rate, </w:t>
-      </w:r>
-      <w:r>
+        <w:t xml:space="preserve"> — 18 structural/style statistics (length, sentence count, type-token ratio, hedge rate, modal rate, sentiment balance, second-person rate and similar) plus three preregistered persona-linked lexical rates required by P10 — 5-fold cross-validated </w:t>
+      </w:r>
+      <w:r>
+        <w:rPr>
+          <w:b/>
+          <w:bCs/>
+        </w:rPr>
+        <w:t>grouped by source prompt</w:t>
+      </w:r>
+      <w:r>
+        <w:t>, so two texts sharing a prompt land in the same fold and topic cannot be memorised. D is never a point on the similarity axis; it is the operationalisation of Song et al.'s equal-or-lower-cost third party, fit per target column.</w:t>
+      </w:r>
+    </w:p>
+    <w:p>
+      <w:pPr>
+        <w:pStyle w:val="BodyText"/>
+      </w:pPr>
+      <w:r>
+        <w:rPr>
+          <w:b/>
+          <w:bCs/>
+        </w:rPr>
         <w:lastRenderedPageBreak/>
-        <w:t xml:space="preserve">sentiment balance, second-person rate and similar) plus three preregistered persona-linked lexical rates required by P10 — 5-fold cross-validated </w:t>
-      </w:r>
-      <w:r>
-        <w:rPr>
-          <w:b/>
-          <w:bCs/>
-        </w:rPr>
-        <w:t>grouped by source prompt</w:t>
-      </w:r>
-      <w:r>
-        <w:t>, so two texts sharing a prompt land in the same fold and topic cannot be memorised. D is never a point on the similarity axis; it is the operationalisation of Song et al.'s equal-or-lower-cost third party, fit per target column.</w:t>
-      </w:r>
-    </w:p>
-    <w:p>
-      <w:pPr>
-        <w:pStyle w:val="BodyText"/>
-      </w:pPr>
-      <w:r>
-        <w:rPr>
-          <w:b/>
-          <w:bCs/>
-        </w:rPr>
         <w:t>Four constructions on one shared pool.</w:t>
       </w:r>
       <w:r>

</xml_diff>